<commit_message>
Carry the rewritten main text into the release
Co-Authored-By: Claude Opus 5.5 (1M context) <noreply@anthropic.com>
</commit_message>
<xml_diff>
--- a/docs/manuscript/SUPPLEMENTAL_TEXT.docx
+++ b/docs/manuscript/SUPPLEMENTAL_TEXT.docx
@@ -11765,7 +11765,7 @@
           <wp:inline>
             <wp:extent cx="4754880" cy="3691584"/>
             <wp:effectExtent b="0" l="0" r="0" t="0"/>
-            <wp:docPr descr="Figure S8. Within-region interaction structure under the calibrated comparison. (A, B) Multidimensional scaling of decorated Brainerd-Robinson dissimilarity for the St. Francis basin, in the lower Mississippi Valley, and for the southeast-Missouri assemblages, in the central Mississippi Valley (Mississippian classes only, so that the comparison is not driven by the Woodland-to-Mississippian gradient), with markers distinguishing within-region spatial clusters. The assemblages intermix rather than separating into clusters. (C) The observed between-cluster cultural F_{ST} for each of the two regions (diamond) against the 95 percent intervals of three models, all run on the real coordinates and subsampled to the observed counts. These are the calibrated neutral spatial-drift model with pooled-profile innovation (dark), the same model with uniform innovation at its nearest calibration combination (mid-gray, which does not fit the assemblages’ diversity in either region), and the bounded-groups model at copying multiplier 0.03 (light). In the basin, and, taken at face value, in southeast Missouri too, the observed F_{ST} lies above the calibrated drift interval. The southeast-Missouri panels document the attempt described in this section rather than a result. The bounded-groups interval reaches it only through its upper tail, with a median close to the drift median, because innovation drawn from the regional profile bypasses the imposed boundary." title="" id="152" name="Picture"/>
+            <wp:docPr descr="Figure S8. Within-region interaction structure under the calibrated comparison. (A, B) Multidimensional scaling of decorated Brainerd-Robinson dissimilarity for the St. Francis basin, in the lower Mississippi Valley, and for the southeast-Missouri assemblages, in the central Mississippi Valley (Mississippian classes only, so that the comparison is not driven by the Woodland-to-Mississippian gradient), with markers distinguishing within-region spatial clusters. The assemblages intermix rather than separating into clusters. (C) The observed between-cluster cultural F_{ST} for each of the two regions (diamond; 0.006 for the basin at two clusters) against the 95 percent intervals of three models, all run on the real coordinates and subsampled to the observed counts. These are the calibrated neutral spatial-drift model with pooled-profile innovation (dark), the same model with uniform innovation at its nearest calibration combination (mid-gray, which does not fit the assemblages’ diversity in either region), and the bounded-groups model at copying multiplier 0.03 (light). In the basin, and, taken at face value, in southeast Missouri too, the observed F_{ST} lies above the calibrated drift interval. The southeast-Missouri panels document the attempt described in this section rather than a result. The bounded-groups interval reaches it only through its upper tail, with a median close to the drift median, because innovation drawn from the regional profile bypasses the imposed boundary." title="" id="152" name="Picture"/>
             <a:graphic>
               <a:graphicData uri="http://schemas.openxmlformats.org/drawingml/2006/picture">
                 <pic:pic>
@@ -11844,7 +11844,7 @@
         <w:t xml:space="preserve"> </w:t>
       </w:r>
       <w:r>
-        <w:t xml:space="preserve">for each of the two regions (diamond) against the 95 percent intervals of three models, all run on the real coordinates and subsampled to the observed counts. These are the calibrated neutral spatial-drift model with pooled-profile innovation (dark), the same model with uniform innovation at its nearest calibration combination (mid-gray, which does not fit the assemblages’ diversity in either region), and the bounded-groups model at copying multiplier 0.03 (light). In the basin, and, taken at face value, in southeast Missouri too, the observed</w:t>
+        <w:t xml:space="preserve">for each of the two regions (diamond; 0.006 for the basin at two clusters) against the 95 percent intervals of three models, all run on the real coordinates and subsampled to the observed counts. These are the calibrated neutral spatial-drift model with pooled-profile innovation (dark), the same model with uniform innovation at its nearest calibration combination (mid-gray, which does not fit the assemblages’ diversity in either region), and the bounded-groups model at copying multiplier 0.03 (light). In the basin, and, taken at face value, in southeast Missouri too, the observed</w:t>
       </w:r>
       <w:r>
         <w:t xml:space="preserve"> </w:t>

</xml_diff>